<commit_message>
fix: korrigiere Rechtsstand und Word-Ausgaben
</commit_message>
<xml_diff>
--- a/docs/vertragsdokumente/bautraegervertrag-lindenhain/bautraegervertrag-lindenhain-de-en.docx
+++ b/docs/vertragsdokumente/bautraegervertrag-lindenhain/bautraegervertrag-lindenhain-de-en.docx
@@ -1,6 +1,6 @@
 
 <file path=word/document.xml><?xml version="1.0" encoding="utf-8"?>
-<w:document xmlns:o="urn:schemas-microsoft-com:office:office" xmlns:r="http://schemas.openxmlformats.org/officeDocument/2006/relationships" xmlns:v="urn:schemas-microsoft-com:vml" xmlns:w="http://schemas.openxmlformats.org/wordprocessingml/2006/main" xmlns:w10="urn:schemas-microsoft-com:office:word" xmlns:wp="http://schemas.openxmlformats.org/drawingml/2006/wordprocessingDrawing" xmlns:pic="http://schemas.openxmlformats.org/drawingml/2006/picture" xmlns:wps="http://schemas.microsoft.com/office/word/2010/wordprocessingShape" xmlns:wpg="http://schemas.microsoft.com/office/word/2010/wordprocessingGroup" xmlns:mc="http://schemas.openxmlformats.org/markup-compatibility/2006" xmlns:wp14="http://schemas.microsoft.com/office/word/2010/wordprocessingDrawing" xmlns:w14="http://schemas.microsoft.com/office/word/2010/wordml" xmlns:w15="http://schemas.microsoft.com/office/word/2012/wordml" mc:Ignorable="w14 wp14 w15">
+<w:document xmlns:ns1="http://schemas.openxmlformats.org/markup-compatibility/2006" xmlns:w="http://schemas.openxmlformats.org/wordprocessingml/2006/main" ns1:Ignorable="w14 wp14 w15">
   <w:body>
     <w:p>
       <w:pPr>
@@ -1245,11 +1245,11 @@
               <w:ind w:hanging="0" w:start="0" w:end="0"/>
               <w:rPr/>
             </w:pPr>
-            <w:bookmarkStart w:id="6" w:name="wohnungsbauträgervertrags-mit-auflassung"/>
+            <w:bookmarkStart w:id="6" w:name="wohnungsbauträgervertrag-mit-auflassung"/>
             <w:bookmarkEnd w:id="6"/>
             <w:r>
               <w:rPr/>
-              <w:t>Wohnungsbauträgervertrags mit Auflassung</w:t>
+              <w:t>Wohnungsbauträgervertrag mit Auflassung</w:t>
             </w:r>
           </w:p>
         </w:tc>
@@ -1267,11 +1267,11 @@
               <w:ind w:hanging="0" w:start="0" w:end="0"/>
               <w:rPr/>
             </w:pPr>
-            <w:bookmarkStart w:id="7" w:name="housing-housing-contract-with-dispositio"/>
+            <w:bookmarkStart w:id="7" w:name="residential-property-development-contrac"/>
             <w:bookmarkEnd w:id="7"/>
             <w:r>
               <w:rPr/>
-              <w:t>Housing housing contract with disposition</w:t>
+              <w:t>Residential Property Development Contract with Conveyance</w:t>
             </w:r>
           </w:p>
         </w:tc>
@@ -2479,6 +2479,81 @@
               <w:t>3.3 Der Kaufpreis ist in höchstens sieben Teilbeträgen nach tatsächlichem Baufortschritt zu zahlen:</w:t>
             </w:r>
           </w:p>
+          <w:p>
+            <w:pPr>
+              <w:pStyle w:val="TableHeading"/>
+              <w:spacing w:before="0" w:after="80"/>
+            </w:pPr>
+            <w:r>
+              <w:rPr>
+                <w:b/>
+              </w:rPr>
+              <w:t>Rate · Fälligkeit frühestens nach tatsächlichem Baufortschritt · Betrag</w:t>
+            </w:r>
+          </w:p>
+          <w:p>
+            <w:pPr>
+              <w:pStyle w:val="TableContents"/>
+              <w:spacing w:before="0" w:after="80"/>
+            </w:pPr>
+            <w:r>
+              <w:t>1 · Beginn der Erdarbeiten, nach Vorliegen der Voraussetzungen aus § 3.1 · 30,0 %</w:t>
+            </w:r>
+          </w:p>
+          <w:p>
+            <w:pPr>
+              <w:pStyle w:val="TableContents"/>
+              <w:spacing w:before="0" w:after="80"/>
+            </w:pPr>
+            <w:r>
+              <w:t>2 · Rohbaufertigstellung einschließlich Zimmererarbeiten · 28,0 %</w:t>
+            </w:r>
+          </w:p>
+          <w:p>
+            <w:pPr>
+              <w:pStyle w:val="TableContents"/>
+              <w:spacing w:before="0" w:after="80"/>
+            </w:pPr>
+            <w:r>
+              <w:t>3 · Herstellung der Dachflächen und Dachrinnen, Rohinstallation Heizung/Sanitär/Elektro, Fenstereinbau einschließlich Verglasung · 18,9 %</w:t>
+            </w:r>
+          </w:p>
+          <w:p>
+            <w:pPr>
+              <w:pStyle w:val="TableContents"/>
+              <w:spacing w:before="0" w:after="80"/>
+            </w:pPr>
+            <w:r>
+              <w:t>4 · Innenputz, Estrich und Fassadenarbeiten · 8,4 %</w:t>
+            </w:r>
+          </w:p>
+          <w:p>
+            <w:pPr>
+              <w:pStyle w:val="TableContents"/>
+              <w:spacing w:before="0" w:after="80"/>
+            </w:pPr>
+            <w:r>
+              <w:t>5 · Fliesenarbeiten im Sanitärbereich · 2,8 %</w:t>
+            </w:r>
+          </w:p>
+          <w:p>
+            <w:pPr>
+              <w:pStyle w:val="TableContents"/>
+              <w:spacing w:before="0" w:after="80"/>
+            </w:pPr>
+            <w:r>
+              <w:t>6 · Bezugsfertigkeit und Zug um Zug gegen Besitzübergabe · 8,4 %</w:t>
+            </w:r>
+          </w:p>
+          <w:p>
+            <w:pPr>
+              <w:pStyle w:val="TableContents"/>
+              <w:spacing w:before="0" w:after="80"/>
+            </w:pPr>
+            <w:r>
+              <w:t>7 · vollständige Fertigstellung einschließlich Außenanlagen, Zuwegungen, Keller, Tiefgarage und Gemeinschaftseinrichtungen · 3,5 %</w:t>
+            </w:r>
+          </w:p>
         </w:tc>
         <w:tc>
           <w:tcPr>
@@ -2498,1098 +2573,90 @@
               <w:t>3.3 The Purchase Price is to be paid in a maximum of seven instalments after actual construction progress:</w:t>
             </w:r>
           </w:p>
-          <w:tbl>
-            <w:tblPr>
-              <w:tblW w:w="12242" w:type="dxa"/>
-              <w:jc w:val="start"/>
-              <w:tblInd w:w="0" w:type="dxa"/>
-              <w:tblLayout w:type="fixed"/>
-              <w:tblCellMar>
-                <w:top w:w="28" w:type="dxa"/>
-                <w:start w:w="28" w:type="dxa"/>
-                <w:bottom w:w="28" w:type="dxa"/>
-                <w:end w:w="28" w:type="dxa"/>
-              </w:tblCellMar>
-            </w:tblPr>
-            <w:tblGrid>
-              <w:gridCol w:w="546"/>
-              <w:gridCol w:w="10916"/>
-              <w:gridCol w:w="780"/>
-            </w:tblGrid>
-            <w:tr>
-              <w:trPr>
-                <w:tblHeader w:val="true"/>
-              </w:trPr>
-              <w:tc>
-                <w:tcPr>
-                  <w:tcW w:w="546" w:type="dxa"/>
-                  <w:tcBorders/>
-                  <w:vAlign w:val="center"/>
-                </w:tcPr>
-                <w:p>
-                  <w:pPr>
-                    <w:pStyle w:val="TableHeading"/>
-                    <w:suppressLineNumbers/>
-                    <w:bidi w:val="0"/>
-                    <w:spacing w:before="0" w:after="283"/>
-                    <w:jc w:val="center"/>
-                    <w:rPr/>
-                  </w:pPr>
-                  <w:r>
-                    <w:rPr/>
-                    <w:t>Rate</w:t>
-                  </w:r>
-                </w:p>
-              </w:tc>
-              <w:tc>
-                <w:tcPr>
-                  <w:tcW w:w="10916" w:type="dxa"/>
-                  <w:tcBorders/>
-                  <w:vAlign w:val="center"/>
-                </w:tcPr>
-                <w:p>
-                  <w:pPr>
-                    <w:pStyle w:val="TableHeading"/>
-                    <w:bidi w:val="0"/>
-                    <w:spacing w:before="0" w:after="283"/>
-                    <w:ind w:hanging="0" w:start="0" w:end="0"/>
-                    <w:rPr/>
-                  </w:pPr>
-                  <w:r>
-                    <w:rPr/>
-                    <w:t>Fälligkeit frühestens nach tatsächlichem Baufortschritt</w:t>
-                  </w:r>
-                </w:p>
-              </w:tc>
-              <w:tc>
-                <w:tcPr>
-                  <w:tcW w:w="780" w:type="dxa"/>
-                  <w:tcBorders/>
-                  <w:vAlign w:val="center"/>
-                </w:tcPr>
-                <w:p>
-                  <w:pPr>
-                    <w:pStyle w:val="TableHeading"/>
-                    <w:bidi w:val="0"/>
-                    <w:spacing w:before="0" w:after="283"/>
-                    <w:jc w:val="end"/>
-                    <w:rPr/>
-                  </w:pPr>
-                  <w:r>
-                    <w:rPr/>
-                    <w:t>Betrag</w:t>
-                  </w:r>
-                </w:p>
-              </w:tc>
-            </w:tr>
-            <w:tr>
-              <w:trPr/>
-              <w:tc>
-                <w:tcPr>
-                  <w:tcW w:w="546" w:type="dxa"/>
-                  <w:tcBorders/>
-                  <w:vAlign w:val="center"/>
-                </w:tcPr>
-                <w:p>
-                  <w:pPr>
-                    <w:pStyle w:val="TableContents"/>
-                    <w:bidi w:val="0"/>
-                    <w:spacing w:before="0" w:after="283"/>
-                    <w:rPr/>
-                  </w:pPr>
-                  <w:r>
-                    <w:rPr/>
-                    <w:t>1</w:t>
-                  </w:r>
-                </w:p>
-              </w:tc>
-              <w:tc>
-                <w:tcPr>
-                  <w:tcW w:w="10916" w:type="dxa"/>
-                  <w:tcBorders/>
-                  <w:vAlign w:val="center"/>
-                </w:tcPr>
-                <w:p>
-                  <w:pPr>
-                    <w:pStyle w:val="TableContents"/>
-                    <w:bidi w:val="0"/>
-                    <w:spacing w:before="0" w:after="283"/>
-                    <w:ind w:hanging="0" w:start="0" w:end="0"/>
-                    <w:rPr/>
-                  </w:pPr>
-                  <w:r>
-                    <w:rPr/>
-                    <w:t>Beginn der Erdarbeiten, nach Vorliegen der Voraussetzungen aus § 3.1</w:t>
-                  </w:r>
-                </w:p>
-              </w:tc>
-              <w:tc>
-                <w:tcPr>
-                  <w:tcW w:w="780" w:type="dxa"/>
-                  <w:tcBorders/>
-                  <w:vAlign w:val="center"/>
-                </w:tcPr>
-                <w:p>
-                  <w:pPr>
-                    <w:pStyle w:val="TableContents"/>
-                    <w:bidi w:val="0"/>
-                    <w:spacing w:before="0" w:after="283"/>
-                    <w:jc w:val="end"/>
-                    <w:rPr/>
-                  </w:pPr>
-                  <w:r>
-                    <w:rPr/>
-                    <w:t>30,0 %</w:t>
-                  </w:r>
-                </w:p>
-              </w:tc>
-            </w:tr>
-            <w:tr>
-              <w:trPr/>
-              <w:tc>
-                <w:tcPr>
-                  <w:tcW w:w="546" w:type="dxa"/>
-                  <w:tcBorders/>
-                  <w:vAlign w:val="center"/>
-                </w:tcPr>
-                <w:p>
-                  <w:pPr>
-                    <w:pStyle w:val="TableContents"/>
-                    <w:bidi w:val="0"/>
-                    <w:spacing w:before="0" w:after="283"/>
-                    <w:rPr/>
-                  </w:pPr>
-                  <w:r>
-                    <w:rPr/>
-                    <w:t>2</w:t>
-                  </w:r>
-                </w:p>
-              </w:tc>
-              <w:tc>
-                <w:tcPr>
-                  <w:tcW w:w="10916" w:type="dxa"/>
-                  <w:tcBorders/>
-                  <w:vAlign w:val="center"/>
-                </w:tcPr>
-                <w:p>
-                  <w:pPr>
-                    <w:pStyle w:val="TableContents"/>
-                    <w:bidi w:val="0"/>
-                    <w:spacing w:before="0" w:after="283"/>
-                    <w:ind w:hanging="0" w:start="0" w:end="0"/>
-                    <w:rPr/>
-                  </w:pPr>
-                  <w:r>
-                    <w:rPr/>
-                    <w:t>Rohbaufertigstellung einschließlich Zimmererarbeiten</w:t>
-                  </w:r>
-                </w:p>
-              </w:tc>
-              <w:tc>
-                <w:tcPr>
-                  <w:tcW w:w="780" w:type="dxa"/>
-                  <w:tcBorders/>
-                  <w:vAlign w:val="center"/>
-                </w:tcPr>
-                <w:p>
-                  <w:pPr>
-                    <w:pStyle w:val="TableContents"/>
-                    <w:bidi w:val="0"/>
-                    <w:spacing w:before="0" w:after="283"/>
-                    <w:jc w:val="end"/>
-                    <w:rPr/>
-                  </w:pPr>
-                  <w:r>
-                    <w:rPr/>
-                    <w:t>28,0 %</w:t>
-                  </w:r>
-                </w:p>
-              </w:tc>
-            </w:tr>
-            <w:tr>
-              <w:trPr/>
-              <w:tc>
-                <w:tcPr>
-                  <w:tcW w:w="546" w:type="dxa"/>
-                  <w:tcBorders/>
-                  <w:vAlign w:val="center"/>
-                </w:tcPr>
-                <w:p>
-                  <w:pPr>
-                    <w:pStyle w:val="TableContents"/>
-                    <w:bidi w:val="0"/>
-                    <w:spacing w:before="0" w:after="283"/>
-                    <w:rPr/>
-                  </w:pPr>
-                  <w:r>
-                    <w:rPr/>
-                    <w:t>3</w:t>
-                  </w:r>
-                </w:p>
-              </w:tc>
-              <w:tc>
-                <w:tcPr>
-                  <w:tcW w:w="10916" w:type="dxa"/>
-                  <w:tcBorders/>
-                  <w:vAlign w:val="center"/>
-                </w:tcPr>
-                <w:p>
-                  <w:pPr>
-                    <w:pStyle w:val="TableContents"/>
-                    <w:bidi w:val="0"/>
-                    <w:spacing w:before="0" w:after="283"/>
-                    <w:ind w:hanging="0" w:start="0" w:end="0"/>
-                    <w:rPr/>
-                  </w:pPr>
-                  <w:r>
-                    <w:rPr/>
-                    <w:t>Herstellung der Dachflächen und Dachrinnen, Rohinstallation Heizung/Sanitär/Elektro, Fenstereinbau einschließlich Verglasung</w:t>
-                  </w:r>
-                </w:p>
-              </w:tc>
-              <w:tc>
-                <w:tcPr>
-                  <w:tcW w:w="780" w:type="dxa"/>
-                  <w:tcBorders/>
-                  <w:vAlign w:val="center"/>
-                </w:tcPr>
-                <w:p>
-                  <w:pPr>
-                    <w:pStyle w:val="TableContents"/>
-                    <w:bidi w:val="0"/>
-                    <w:spacing w:before="0" w:after="283"/>
-                    <w:jc w:val="end"/>
-                    <w:rPr/>
-                  </w:pPr>
-                  <w:r>
-                    <w:rPr/>
-                    <w:t>18,9 %</w:t>
-                  </w:r>
-                </w:p>
-              </w:tc>
-            </w:tr>
-            <w:tr>
-              <w:trPr/>
-              <w:tc>
-                <w:tcPr>
-                  <w:tcW w:w="546" w:type="dxa"/>
-                  <w:tcBorders/>
-                  <w:vAlign w:val="center"/>
-                </w:tcPr>
-                <w:p>
-                  <w:pPr>
-                    <w:pStyle w:val="TableContents"/>
-                    <w:bidi w:val="0"/>
-                    <w:spacing w:before="0" w:after="283"/>
-                    <w:rPr/>
-                  </w:pPr>
-                  <w:r>
-                    <w:rPr/>
-                    <w:t>4</w:t>
-                  </w:r>
-                </w:p>
-              </w:tc>
-              <w:tc>
-                <w:tcPr>
-                  <w:tcW w:w="10916" w:type="dxa"/>
-                  <w:tcBorders/>
-                  <w:vAlign w:val="center"/>
-                </w:tcPr>
-                <w:p>
-                  <w:pPr>
-                    <w:pStyle w:val="TableContents"/>
-                    <w:bidi w:val="0"/>
-                    <w:spacing w:before="0" w:after="283"/>
-                    <w:ind w:hanging="0" w:start="0" w:end="0"/>
-                    <w:rPr/>
-                  </w:pPr>
-                  <w:r>
-                    <w:rPr/>
-                    <w:t>Innenputz, Estrich und Fassadenarbeiten</w:t>
-                  </w:r>
-                </w:p>
-              </w:tc>
-              <w:tc>
-                <w:tcPr>
-                  <w:tcW w:w="780" w:type="dxa"/>
-                  <w:tcBorders/>
-                  <w:vAlign w:val="center"/>
-                </w:tcPr>
-                <w:p>
-                  <w:pPr>
-                    <w:pStyle w:val="TableContents"/>
-                    <w:bidi w:val="0"/>
-                    <w:spacing w:before="0" w:after="283"/>
-                    <w:jc w:val="end"/>
-                    <w:rPr/>
-                  </w:pPr>
-                  <w:r>
-                    <w:rPr/>
-                    <w:t>8,4 %</w:t>
-                  </w:r>
-                </w:p>
-              </w:tc>
-            </w:tr>
-            <w:tr>
-              <w:trPr/>
-              <w:tc>
-                <w:tcPr>
-                  <w:tcW w:w="546" w:type="dxa"/>
-                  <w:tcBorders/>
-                  <w:vAlign w:val="center"/>
-                </w:tcPr>
-                <w:p>
-                  <w:pPr>
-                    <w:pStyle w:val="TableContents"/>
-                    <w:bidi w:val="0"/>
-                    <w:spacing w:before="0" w:after="283"/>
-                    <w:rPr/>
-                  </w:pPr>
-                  <w:r>
-                    <w:rPr/>
-                    <w:t>5</w:t>
-                  </w:r>
-                </w:p>
-              </w:tc>
-              <w:tc>
-                <w:tcPr>
-                  <w:tcW w:w="10916" w:type="dxa"/>
-                  <w:tcBorders/>
-                  <w:vAlign w:val="center"/>
-                </w:tcPr>
-                <w:p>
-                  <w:pPr>
-                    <w:pStyle w:val="TableContents"/>
-                    <w:bidi w:val="0"/>
-                    <w:spacing w:before="0" w:after="283"/>
-                    <w:ind w:hanging="0" w:start="0" w:end="0"/>
-                    <w:rPr/>
-                  </w:pPr>
-                  <w:r>
-                    <w:rPr/>
-                    <w:t>Fliesenarbeiten im Sanitärbereich</w:t>
-                  </w:r>
-                </w:p>
-              </w:tc>
-              <w:tc>
-                <w:tcPr>
-                  <w:tcW w:w="780" w:type="dxa"/>
-                  <w:tcBorders/>
-                  <w:vAlign w:val="center"/>
-                </w:tcPr>
-                <w:p>
-                  <w:pPr>
-                    <w:pStyle w:val="TableContents"/>
-                    <w:bidi w:val="0"/>
-                    <w:spacing w:before="0" w:after="283"/>
-                    <w:jc w:val="end"/>
-                    <w:rPr/>
-                  </w:pPr>
-                  <w:r>
-                    <w:rPr/>
-                    <w:t>2,8 %</w:t>
-                  </w:r>
-                </w:p>
-              </w:tc>
-            </w:tr>
-            <w:tr>
-              <w:trPr/>
-              <w:tc>
-                <w:tcPr>
-                  <w:tcW w:w="546" w:type="dxa"/>
-                  <w:tcBorders/>
-                  <w:vAlign w:val="center"/>
-                </w:tcPr>
-                <w:p>
-                  <w:pPr>
-                    <w:pStyle w:val="TableContents"/>
-                    <w:bidi w:val="0"/>
-                    <w:spacing w:before="0" w:after="283"/>
-                    <w:rPr/>
-                  </w:pPr>
-                  <w:r>
-                    <w:rPr/>
-                    <w:t>6</w:t>
-                  </w:r>
-                </w:p>
-              </w:tc>
-              <w:tc>
-                <w:tcPr>
-                  <w:tcW w:w="10916" w:type="dxa"/>
-                  <w:tcBorders/>
-                  <w:vAlign w:val="center"/>
-                </w:tcPr>
-                <w:p>
-                  <w:pPr>
-                    <w:pStyle w:val="TableContents"/>
-                    <w:bidi w:val="0"/>
-                    <w:spacing w:before="0" w:after="283"/>
-                    <w:ind w:hanging="0" w:start="0" w:end="0"/>
-                    <w:rPr/>
-                  </w:pPr>
-                  <w:r>
-                    <w:rPr/>
-                    <w:t>Bezugsfertigkeit und Zug um Zug gegen Besitzübergabe</w:t>
-                  </w:r>
-                </w:p>
-              </w:tc>
-              <w:tc>
-                <w:tcPr>
-                  <w:tcW w:w="780" w:type="dxa"/>
-                  <w:tcBorders/>
-                  <w:vAlign w:val="center"/>
-                </w:tcPr>
-                <w:p>
-                  <w:pPr>
-                    <w:pStyle w:val="TableContents"/>
-                    <w:bidi w:val="0"/>
-                    <w:spacing w:before="0" w:after="283"/>
-                    <w:jc w:val="end"/>
-                    <w:rPr/>
-                  </w:pPr>
-                  <w:r>
-                    <w:rPr/>
-                    <w:t>8,4 %</w:t>
-                  </w:r>
-                </w:p>
-              </w:tc>
-            </w:tr>
-            <w:tr>
-              <w:trPr/>
-              <w:tc>
-                <w:tcPr>
-                  <w:tcW w:w="546" w:type="dxa"/>
-                  <w:tcBorders/>
-                  <w:vAlign w:val="center"/>
-                </w:tcPr>
-                <w:p>
-                  <w:pPr>
-                    <w:pStyle w:val="TableContents"/>
-                    <w:bidi w:val="0"/>
-                    <w:spacing w:before="0" w:after="283"/>
-                    <w:rPr/>
-                  </w:pPr>
-                  <w:r>
-                    <w:rPr/>
-                    <w:t>7</w:t>
-                  </w:r>
-                </w:p>
-              </w:tc>
-              <w:tc>
-                <w:tcPr>
-                  <w:tcW w:w="10916" w:type="dxa"/>
-                  <w:tcBorders/>
-                  <w:vAlign w:val="center"/>
-                </w:tcPr>
-                <w:p>
-                  <w:pPr>
-                    <w:pStyle w:val="TableContents"/>
-                    <w:bidi w:val="0"/>
-                    <w:spacing w:before="0" w:after="283"/>
-                    <w:ind w:hanging="0" w:start="0" w:end="0"/>
-                    <w:rPr/>
-                  </w:pPr>
-                  <w:r>
-                    <w:rPr/>
-                    <w:t>vollständige Fertigstellung einschließlich Außenanlagen, Zuwegungen, Keller, Tiefgarage und Gemeinschaftseinrichtungen</w:t>
-                  </w:r>
-                </w:p>
-              </w:tc>
-              <w:tc>
-                <w:tcPr>
-                  <w:tcW w:w="780" w:type="dxa"/>
-                  <w:tcBorders/>
-                  <w:vAlign w:val="center"/>
-                </w:tcPr>
-                <w:p>
-                  <w:pPr>
-                    <w:pStyle w:val="TableContents"/>
-                    <w:bidi w:val="0"/>
-                    <w:spacing w:before="0" w:after="283"/>
-                    <w:jc w:val="end"/>
-                    <w:rPr/>
-                  </w:pPr>
-                  <w:r>
-                    <w:rPr/>
-                    <w:t>3,5 %</w:t>
-                  </w:r>
-                </w:p>
-              </w:tc>
-            </w:tr>
-          </w:tbl>
-          <w:p>
-            <w:pPr>
-              <w:pStyle w:val="TableContents"/>
-              <w:bidi w:val="0"/>
-              <w:spacing w:before="0" w:after="283"/>
-              <w:rPr/>
-            </w:pPr>
-            <w:r>
-              <w:rPr/>
-            </w:r>
-          </w:p>
-        </w:tc>
-      </w:tr>
-      <w:tr>
-        <w:trPr/>
-        <w:tc>
-          <w:tcPr>
-            <w:tcW w:w="7569" w:type="dxa"/>
-            <w:tcBorders/>
-            <w:vAlign w:val="center"/>
-          </w:tcPr>
-          <w:tbl>
-            <w:tblPr>
-              <w:tblW w:w="11631" w:type="dxa"/>
-              <w:jc w:val="start"/>
-              <w:tblInd w:w="0" w:type="dxa"/>
-              <w:tblLayout w:type="fixed"/>
-              <w:tblCellMar>
-                <w:top w:w="28" w:type="dxa"/>
-                <w:start w:w="28" w:type="dxa"/>
-                <w:bottom w:w="28" w:type="dxa"/>
-                <w:end w:w="28" w:type="dxa"/>
-              </w:tblCellMar>
-            </w:tblPr>
-            <w:tblGrid>
-              <w:gridCol w:w="546"/>
-              <w:gridCol w:w="10305"/>
-              <w:gridCol w:w="780"/>
-            </w:tblGrid>
-            <w:tr>
-              <w:trPr>
-                <w:tblHeader w:val="true"/>
-              </w:trPr>
-              <w:tc>
-                <w:tcPr>
-                  <w:tcW w:w="546" w:type="dxa"/>
-                  <w:tcBorders/>
-                  <w:vAlign w:val="center"/>
-                </w:tcPr>
-                <w:p>
-                  <w:pPr>
-                    <w:pStyle w:val="TableHeading"/>
-                    <w:suppressLineNumbers/>
-                    <w:bidi w:val="0"/>
-                    <w:spacing w:before="0" w:after="283"/>
-                    <w:jc w:val="center"/>
-                    <w:rPr/>
-                  </w:pPr>
-                  <w:r>
-                    <w:rPr/>
-                    <w:t>Rate</w:t>
-                  </w:r>
-                </w:p>
-              </w:tc>
-              <w:tc>
-                <w:tcPr>
-                  <w:tcW w:w="10305" w:type="dxa"/>
-                  <w:tcBorders/>
-                  <w:vAlign w:val="center"/>
-                </w:tcPr>
-                <w:p>
-                  <w:pPr>
-                    <w:pStyle w:val="TableHeading"/>
-                    <w:bidi w:val="0"/>
-                    <w:spacing w:before="0" w:after="283"/>
-                    <w:ind w:hanging="0" w:start="0" w:end="0"/>
-                    <w:rPr/>
-                  </w:pPr>
-                  <w:r>
-                    <w:rPr/>
-                    <w:t>Maturity at the earliest after actual construction progress</w:t>
-                  </w:r>
-                </w:p>
-              </w:tc>
-              <w:tc>
-                <w:tcPr>
-                  <w:tcW w:w="780" w:type="dxa"/>
-                  <w:tcBorders/>
-                  <w:vAlign w:val="center"/>
-                </w:tcPr>
-                <w:p>
-                  <w:pPr>
-                    <w:pStyle w:val="TableHeading"/>
-                    <w:bidi w:val="0"/>
-                    <w:spacing w:before="0" w:after="283"/>
-                    <w:jc w:val="end"/>
-                    <w:rPr/>
-                  </w:pPr>
-                  <w:r>
-                    <w:rPr/>
-                    <w:t>Betrag</w:t>
-                  </w:r>
-                </w:p>
-              </w:tc>
-            </w:tr>
-            <w:tr>
-              <w:trPr/>
-              <w:tc>
-                <w:tcPr>
-                  <w:tcW w:w="546" w:type="dxa"/>
-                  <w:tcBorders/>
-                  <w:vAlign w:val="center"/>
-                </w:tcPr>
-                <w:p>
-                  <w:pPr>
-                    <w:pStyle w:val="TableContents"/>
-                    <w:bidi w:val="0"/>
-                    <w:spacing w:before="0" w:after="283"/>
-                    <w:rPr/>
-                  </w:pPr>
-                  <w:r>
-                    <w:rPr/>
-                    <w:t>1</w:t>
-                  </w:r>
-                </w:p>
-              </w:tc>
-              <w:tc>
-                <w:tcPr>
-                  <w:tcW w:w="10305" w:type="dxa"/>
-                  <w:tcBorders/>
-                  <w:vAlign w:val="center"/>
-                </w:tcPr>
-                <w:p>
-                  <w:pPr>
-                    <w:pStyle w:val="TableContents"/>
-                    <w:bidi w:val="0"/>
-                    <w:spacing w:before="0" w:after="283"/>
-                    <w:ind w:hanging="0" w:start="0" w:end="0"/>
-                    <w:rPr/>
-                  </w:pPr>
-                  <w:r>
-                    <w:rPr/>
-                    <w:t>Beginn der Erdarbeiten, nach Vorliegen der Voraussetzungen aus § 3.1</w:t>
-                  </w:r>
-                </w:p>
-              </w:tc>
-              <w:tc>
-                <w:tcPr>
-                  <w:tcW w:w="780" w:type="dxa"/>
-                  <w:tcBorders/>
-                  <w:vAlign w:val="center"/>
-                </w:tcPr>
-                <w:p>
-                  <w:pPr>
-                    <w:pStyle w:val="TableContents"/>
-                    <w:bidi w:val="0"/>
-                    <w:spacing w:before="0" w:after="283"/>
-                    <w:jc w:val="end"/>
-                    <w:rPr/>
-                  </w:pPr>
-                  <w:r>
-                    <w:rPr/>
-                    <w:t>30,0 %</w:t>
-                  </w:r>
-                </w:p>
-              </w:tc>
-            </w:tr>
-            <w:tr>
-              <w:trPr/>
-              <w:tc>
-                <w:tcPr>
-                  <w:tcW w:w="546" w:type="dxa"/>
-                  <w:tcBorders/>
-                  <w:vAlign w:val="center"/>
-                </w:tcPr>
-                <w:p>
-                  <w:pPr>
-                    <w:pStyle w:val="TableContents"/>
-                    <w:bidi w:val="0"/>
-                    <w:spacing w:before="0" w:after="283"/>
-                    <w:rPr/>
-                  </w:pPr>
-                  <w:r>
-                    <w:rPr/>
-                    <w:t>2</w:t>
-                  </w:r>
-                </w:p>
-              </w:tc>
-              <w:tc>
-                <w:tcPr>
-                  <w:tcW w:w="10305" w:type="dxa"/>
-                  <w:tcBorders/>
-                  <w:vAlign w:val="center"/>
-                </w:tcPr>
-                <w:p>
-                  <w:pPr>
-                    <w:pStyle w:val="TableContents"/>
-                    <w:bidi w:val="0"/>
-                    <w:spacing w:before="0" w:after="283"/>
-                    <w:ind w:hanging="0" w:start="0" w:end="0"/>
-                    <w:rPr/>
-                  </w:pPr>
-                  <w:r>
-                    <w:rPr/>
-                    <w:t>Completion of shells, including carpentry</w:t>
-                  </w:r>
-                </w:p>
-              </w:tc>
-              <w:tc>
-                <w:tcPr>
-                  <w:tcW w:w="780" w:type="dxa"/>
-                  <w:tcBorders/>
-                  <w:vAlign w:val="center"/>
-                </w:tcPr>
-                <w:p>
-                  <w:pPr>
-                    <w:pStyle w:val="TableContents"/>
-                    <w:bidi w:val="0"/>
-                    <w:spacing w:before="0" w:after="283"/>
-                    <w:jc w:val="end"/>
-                    <w:rPr/>
-                  </w:pPr>
-                  <w:r>
-                    <w:rPr/>
-                    <w:t>28,0 %</w:t>
-                  </w:r>
-                </w:p>
-              </w:tc>
-            </w:tr>
-            <w:tr>
-              <w:trPr/>
-              <w:tc>
-                <w:tcPr>
-                  <w:tcW w:w="546" w:type="dxa"/>
-                  <w:tcBorders/>
-                  <w:vAlign w:val="center"/>
-                </w:tcPr>
-                <w:p>
-                  <w:pPr>
-                    <w:pStyle w:val="TableContents"/>
-                    <w:bidi w:val="0"/>
-                    <w:spacing w:before="0" w:after="283"/>
-                    <w:rPr/>
-                  </w:pPr>
-                  <w:r>
-                    <w:rPr/>
-                    <w:t>3</w:t>
-                  </w:r>
-                </w:p>
-              </w:tc>
-              <w:tc>
-                <w:tcPr>
-                  <w:tcW w:w="10305" w:type="dxa"/>
-                  <w:tcBorders/>
-                  <w:vAlign w:val="center"/>
-                </w:tcPr>
-                <w:p>
-                  <w:pPr>
-                    <w:pStyle w:val="TableContents"/>
-                    <w:bidi w:val="0"/>
-                    <w:spacing w:before="0" w:after="283"/>
-                    <w:ind w:hanging="0" w:start="0" w:end="0"/>
-                    <w:rPr/>
-                  </w:pPr>
-                  <w:r>
-                    <w:rPr/>
-                    <w:t>Manufacture of roof surfaces and gutters, heating/sanitary/electric raw installation, window installation including glazing</w:t>
-                  </w:r>
-                </w:p>
-              </w:tc>
-              <w:tc>
-                <w:tcPr>
-                  <w:tcW w:w="780" w:type="dxa"/>
-                  <w:tcBorders/>
-                  <w:vAlign w:val="center"/>
-                </w:tcPr>
-                <w:p>
-                  <w:pPr>
-                    <w:pStyle w:val="TableContents"/>
-                    <w:bidi w:val="0"/>
-                    <w:spacing w:before="0" w:after="283"/>
-                    <w:jc w:val="end"/>
-                    <w:rPr/>
-                  </w:pPr>
-                  <w:r>
-                    <w:rPr/>
-                    <w:t>18,9 %</w:t>
-                  </w:r>
-                </w:p>
-              </w:tc>
-            </w:tr>
-            <w:tr>
-              <w:trPr/>
-              <w:tc>
-                <w:tcPr>
-                  <w:tcW w:w="546" w:type="dxa"/>
-                  <w:tcBorders/>
-                  <w:vAlign w:val="center"/>
-                </w:tcPr>
-                <w:p>
-                  <w:pPr>
-                    <w:pStyle w:val="TableContents"/>
-                    <w:bidi w:val="0"/>
-                    <w:spacing w:before="0" w:after="283"/>
-                    <w:rPr/>
-                  </w:pPr>
-                  <w:r>
-                    <w:rPr/>
-                    <w:t>4</w:t>
-                  </w:r>
-                </w:p>
-              </w:tc>
-              <w:tc>
-                <w:tcPr>
-                  <w:tcW w:w="10305" w:type="dxa"/>
-                  <w:tcBorders/>
-                  <w:vAlign w:val="center"/>
-                </w:tcPr>
-                <w:p>
-                  <w:pPr>
-                    <w:pStyle w:val="TableContents"/>
-                    <w:bidi w:val="0"/>
-                    <w:spacing w:before="0" w:after="283"/>
-                    <w:ind w:hanging="0" w:start="0" w:end="0"/>
-                    <w:rPr/>
-                  </w:pPr>
-                  <w:r>
-                    <w:rPr/>
-                    <w:t>Innenputz, Estrich und Fassadenarbeiten</w:t>
-                  </w:r>
-                </w:p>
-              </w:tc>
-              <w:tc>
-                <w:tcPr>
-                  <w:tcW w:w="780" w:type="dxa"/>
-                  <w:tcBorders/>
-                  <w:vAlign w:val="center"/>
-                </w:tcPr>
-                <w:p>
-                  <w:pPr>
-                    <w:pStyle w:val="TableContents"/>
-                    <w:bidi w:val="0"/>
-                    <w:spacing w:before="0" w:after="283"/>
-                    <w:jc w:val="end"/>
-                    <w:rPr/>
-                  </w:pPr>
-                  <w:r>
-                    <w:rPr/>
-                    <w:t>8,4 %</w:t>
-                  </w:r>
-                </w:p>
-              </w:tc>
-            </w:tr>
-            <w:tr>
-              <w:trPr/>
-              <w:tc>
-                <w:tcPr>
-                  <w:tcW w:w="546" w:type="dxa"/>
-                  <w:tcBorders/>
-                  <w:vAlign w:val="center"/>
-                </w:tcPr>
-                <w:p>
-                  <w:pPr>
-                    <w:pStyle w:val="TableContents"/>
-                    <w:bidi w:val="0"/>
-                    <w:spacing w:before="0" w:after="283"/>
-                    <w:rPr/>
-                  </w:pPr>
-                  <w:r>
-                    <w:rPr/>
-                    <w:t>5</w:t>
-                  </w:r>
-                </w:p>
-              </w:tc>
-              <w:tc>
-                <w:tcPr>
-                  <w:tcW w:w="10305" w:type="dxa"/>
-                  <w:tcBorders/>
-                  <w:vAlign w:val="center"/>
-                </w:tcPr>
-                <w:p>
-                  <w:pPr>
-                    <w:pStyle w:val="TableContents"/>
-                    <w:bidi w:val="0"/>
-                    <w:spacing w:before="0" w:after="283"/>
-                    <w:ind w:hanging="0" w:start="0" w:end="0"/>
-                    <w:rPr/>
-                  </w:pPr>
-                  <w:r>
-                    <w:rPr/>
-                    <w:t>Sanitary tile work</w:t>
-                  </w:r>
-                </w:p>
-              </w:tc>
-              <w:tc>
-                <w:tcPr>
-                  <w:tcW w:w="780" w:type="dxa"/>
-                  <w:tcBorders/>
-                  <w:vAlign w:val="center"/>
-                </w:tcPr>
-                <w:p>
-                  <w:pPr>
-                    <w:pStyle w:val="TableContents"/>
-                    <w:bidi w:val="0"/>
-                    <w:spacing w:before="0" w:after="283"/>
-                    <w:jc w:val="end"/>
-                    <w:rPr/>
-                  </w:pPr>
-                  <w:r>
-                    <w:rPr/>
-                    <w:t>2,8 %</w:t>
-                  </w:r>
-                </w:p>
-              </w:tc>
-            </w:tr>
-            <w:tr>
-              <w:trPr/>
-              <w:tc>
-                <w:tcPr>
-                  <w:tcW w:w="546" w:type="dxa"/>
-                  <w:tcBorders/>
-                  <w:vAlign w:val="center"/>
-                </w:tcPr>
-                <w:p>
-                  <w:pPr>
-                    <w:pStyle w:val="TableContents"/>
-                    <w:bidi w:val="0"/>
-                    <w:spacing w:before="0" w:after="283"/>
-                    <w:rPr/>
-                  </w:pPr>
-                  <w:r>
-                    <w:rPr/>
-                    <w:t>6</w:t>
-                  </w:r>
-                </w:p>
-              </w:tc>
-              <w:tc>
-                <w:tcPr>
-                  <w:tcW w:w="10305" w:type="dxa"/>
-                  <w:tcBorders/>
-                  <w:vAlign w:val="center"/>
-                </w:tcPr>
-                <w:p>
-                  <w:pPr>
-                    <w:pStyle w:val="TableContents"/>
-                    <w:bidi w:val="0"/>
-                    <w:spacing w:before="0" w:after="283"/>
-                    <w:ind w:hanging="0" w:start="0" w:end="0"/>
-                    <w:rPr/>
-                  </w:pPr>
-                  <w:r>
-                    <w:rPr/>
-                    <w:t>Skill of reference and train by train against transfer of ownership</w:t>
-                  </w:r>
-                </w:p>
-              </w:tc>
-              <w:tc>
-                <w:tcPr>
-                  <w:tcW w:w="780" w:type="dxa"/>
-                  <w:tcBorders/>
-                  <w:vAlign w:val="center"/>
-                </w:tcPr>
-                <w:p>
-                  <w:pPr>
-                    <w:pStyle w:val="TableContents"/>
-                    <w:bidi w:val="0"/>
-                    <w:spacing w:before="0" w:after="283"/>
-                    <w:jc w:val="end"/>
-                    <w:rPr/>
-                  </w:pPr>
-                  <w:r>
-                    <w:rPr/>
-                    <w:t>8,4 %</w:t>
-                  </w:r>
-                </w:p>
-              </w:tc>
-            </w:tr>
-            <w:tr>
-              <w:trPr/>
-              <w:tc>
-                <w:tcPr>
-                  <w:tcW w:w="546" w:type="dxa"/>
-                  <w:tcBorders/>
-                  <w:vAlign w:val="center"/>
-                </w:tcPr>
-                <w:p>
-                  <w:pPr>
-                    <w:pStyle w:val="TableContents"/>
-                    <w:bidi w:val="0"/>
-                    <w:spacing w:before="0" w:after="283"/>
-                    <w:rPr/>
-                  </w:pPr>
-                  <w:r>
-                    <w:rPr/>
-                    <w:t>7</w:t>
-                  </w:r>
-                </w:p>
-              </w:tc>
-              <w:tc>
-                <w:tcPr>
-                  <w:tcW w:w="10305" w:type="dxa"/>
-                  <w:tcBorders/>
-                  <w:vAlign w:val="center"/>
-                </w:tcPr>
-                <w:p>
-                  <w:pPr>
-                    <w:pStyle w:val="TableContents"/>
-                    <w:bidi w:val="0"/>
-                    <w:spacing w:before="0" w:after="283"/>
-                    <w:ind w:hanging="0" w:start="0" w:end="0"/>
-                    <w:rPr/>
-                  </w:pPr>
-                  <w:r>
-                    <w:rPr/>
-                    <w:t>Complete completion including outdoor facilities, accesses, basements, underground parking and community facilities</w:t>
-                  </w:r>
-                </w:p>
-              </w:tc>
-              <w:tc>
-                <w:tcPr>
-                  <w:tcW w:w="780" w:type="dxa"/>
-                  <w:tcBorders/>
-                  <w:vAlign w:val="center"/>
-                </w:tcPr>
-                <w:p>
-                  <w:pPr>
-                    <w:pStyle w:val="TableContents"/>
-                    <w:bidi w:val="0"/>
-                    <w:spacing w:before="0" w:after="283"/>
-                    <w:jc w:val="end"/>
-                    <w:rPr/>
-                  </w:pPr>
-                  <w:r>
-                    <w:rPr/>
-                    <w:t>3,5 %</w:t>
-                  </w:r>
-                </w:p>
-              </w:tc>
-            </w:tr>
-          </w:tbl>
-          <w:p>
-            <w:pPr>
-              <w:pStyle w:val="TableContents"/>
-              <w:bidi w:val="0"/>
-              <w:spacing w:before="0" w:after="283"/>
-              <w:rPr/>
-            </w:pPr>
-            <w:r>
-              <w:rPr/>
-            </w:r>
-          </w:p>
-        </w:tc>
-        <w:tc>
-          <w:tcPr>
-            <w:tcW w:w="7965" w:type="dxa"/>
-            <w:tcBorders/>
-            <w:vAlign w:val="center"/>
-          </w:tcPr>
-          <w:p>
-            <w:pPr>
-              <w:pStyle w:val="TableContents"/>
-              <w:bidi w:val="0"/>
-              <w:spacing w:before="0" w:after="283"/>
+          <w:p>
+            <w:pPr>
+              <w:pStyle w:val="TableContents"/>
+              <w:bidi w:val="0"/>
+              <w:spacing w:before="0" w:after="283"/>
+              <w:rPr/>
+            </w:pPr>
+            <w:r>
+              <w:rPr/>
+            </w:r>
+          </w:p>
+          <w:p>
+            <w:pPr>
+              <w:pStyle w:val="TableHeading"/>
+              <w:spacing w:before="0" w:after="80"/>
+            </w:pPr>
+            <w:r>
               <w:rPr>
-                <w:sz w:val="4"/>
-                <w:szCs w:val="4"/>
+                <w:b/>
               </w:rPr>
-            </w:pPr>
-            <w:r>
-              <w:rPr>
-                <w:sz w:val="4"/>
-                <w:szCs w:val="4"/>
-              </w:rPr>
+              <w:t>Rate · Maturity at the earliest after actual construction progress · Percentage</w:t>
+            </w:r>
+          </w:p>
+          <w:p>
+            <w:pPr>
+              <w:pStyle w:val="TableContents"/>
+              <w:spacing w:before="0" w:after="80"/>
+            </w:pPr>
+            <w:r>
+              <w:t>1 · after commencement of earthworks and satisfaction of the conditions in § 3.1 · 30,0 %</w:t>
+            </w:r>
+          </w:p>
+          <w:p>
+            <w:pPr>
+              <w:pStyle w:val="TableContents"/>
+              <w:spacing w:before="0" w:after="80"/>
+            </w:pPr>
+            <w:r>
+              <w:t>2 · Completion of shells, including carpentry · 28,0 %</w:t>
+            </w:r>
+          </w:p>
+          <w:p>
+            <w:pPr>
+              <w:pStyle w:val="TableContents"/>
+              <w:spacing w:before="0" w:after="80"/>
+            </w:pPr>
+            <w:r>
+              <w:t>3 · Manufacture of roof surfaces and gutters, heating/sanitary/electric raw installation, window installation including glazing · 18,9 %</w:t>
+            </w:r>
+          </w:p>
+          <w:p>
+            <w:pPr>
+              <w:pStyle w:val="TableContents"/>
+              <w:spacing w:before="0" w:after="80"/>
+            </w:pPr>
+            <w:r>
+              <w:t>4 · interior plaster, screed and facade works · 8,4 %</w:t>
+            </w:r>
+          </w:p>
+          <w:p>
+            <w:pPr>
+              <w:pStyle w:val="TableContents"/>
+              <w:spacing w:before="0" w:after="80"/>
+            </w:pPr>
+            <w:r>
+              <w:t>5 · Sanitary tile work · 2,8 %</w:t>
+            </w:r>
+          </w:p>
+          <w:p>
+            <w:pPr>
+              <w:pStyle w:val="TableContents"/>
+              <w:spacing w:before="0" w:after="80"/>
+            </w:pPr>
+            <w:r>
+              <w:t>6 · readiness for occupancy concurrently with transfer of possession · 8,4 %</w:t>
+            </w:r>
+          </w:p>
+          <w:p>
+            <w:pPr>
+              <w:pStyle w:val="TableContents"/>
+              <w:spacing w:before="0" w:after="80"/>
+            </w:pPr>
+            <w:r>
+              <w:t>7 · Complete completion including outdoor facilities, accesses, basements, underground parking and community facilities · 3,5 %</w:t>
             </w:r>
           </w:p>
         </w:tc>

</xml_diff>